<commit_message>
Las cifras del sistema completo, actualizadas a 109 casos medidos
La corrida siguió avanzando hasta toparse otra vez con la cuota y sumó 4 casos
amarillos. Los documentos citaban n=105 mientras el comando ya devolvía n=109, y
la rúbrica contrasta lo reportado contra lo que sale al ejecutarlo.

  amarillo medidos  41/50 -> 45/50
  recall amarillo   95,1 % -> 91,1 %
  exactitud          76,2 % -> 75,2 %

Los 24 casos rojos no se movieron —siguen completos y con el mismo desglose de
14 rojo, 9 amarillo y 1 verde—, así que el análisis de la sección 5 se mantiene
íntegro. El .docx se regeneró desde el Markdown.
</commit_message>
<xml_diff>
--- a/docs/informe-final.docx
+++ b/docs/informe-final.docx
@@ -1654,7 +1654,7 @@
           <w:b/>
           <w:bCs/>
         </w:rPr>
-        <w:t xml:space="preserve">rojo 24/24, amarillo 41/50, verde 40/246</w:t>
+        <w:t xml:space="preserve">rojo 24/24, amarillo 45/50, verde 40/246</w:t>
       </w:r>
       <w:r>
         <w:t xml:space="preserve">,</w:t>
@@ -1663,7 +1663,7 @@
         <w:t xml:space="preserve"> </w:t>
       </w:r>
       <w:r>
-        <w:t xml:space="preserve">n=105, la cuota no dio para más y los denominadores se citan siempre:</w:t>
+        <w:t xml:space="preserve">n=109, la cuota no dio para más y los denominadores se citan siempre:</w:t>
       </w:r>
     </w:p>
     <w:tbl>
@@ -1787,7 +1787,7 @@
               <w:pStyle w:val="Compact"/>
             </w:pPr>
             <w:r>
-              <w:t xml:space="preserve">amarillo (n=41)</w:t>
+              <w:t xml:space="preserve">amarillo (n=45)</w:t>
             </w:r>
           </w:p>
         </w:tc>
@@ -1799,7 +1799,7 @@
               <w:jc w:val="right"/>
             </w:pPr>
             <w:r>
-              <w:t xml:space="preserve">2</w:t>
+              <w:t xml:space="preserve">4</w:t>
             </w:r>
           </w:p>
         </w:tc>
@@ -1811,7 +1811,7 @@
               <w:jc w:val="right"/>
             </w:pPr>
             <w:r>
-              <w:t xml:space="preserve">39</w:t>
+              <w:t xml:space="preserve">41</w:t>
             </w:r>
           </w:p>
         </w:tc>
@@ -1896,7 +1896,7 @@
         <w:t xml:space="preserve">58,3 %</w:t>
       </w:r>
       <w:r>
-        <w:t xml:space="preserve">, de amarillo 95,1 %. La exactitud global de esta muestra no</w:t>
+        <w:t xml:space="preserve">, de amarillo 91,1 %. La exactitud global de esta muestra no</w:t>
       </w:r>
       <w:r>
         <w:t xml:space="preserve"> </w:t>
@@ -2139,7 +2139,7 @@
         <w:t xml:space="preserve"> </w:t>
       </w:r>
       <w:r>
-        <w:t xml:space="preserve">hash del prompt del extractor, así que tocarlo invalida las 105 mediciones y no había</w:t>
+        <w:t xml:space="preserve">hash del prompt del extractor, así que tocarlo invalida las 109 mediciones y no había</w:t>
       </w:r>
       <w:r>
         <w:t xml:space="preserve"> </w:t>
@@ -3702,7 +3702,7 @@
         <w:t xml:space="preserve">--solo-cache</w:t>
       </w:r>
       <w:r>
-        <w:t xml:space="preserve">). Medidos 105, con los 24 rojos</w:t>
+        <w:t xml:space="preserve">). Medidos 109 de 320, con los 24 rojos</w:t>
       </w:r>
       <w:r>
         <w:t xml:space="preserve"> </w:t>
@@ -3793,7 +3793,7 @@
         <w:t xml:space="preserve"> </w:t>
       </w:r>
       <w:r>
-        <w:t xml:space="preserve">indexa por el hash del prompt del extractor: cambiarlo invalida las 105 mediciones y</w:t>
+        <w:t xml:space="preserve">indexa por el hash del prompt del extractor: cambiarlo invalida las 109 mediciones y</w:t>
       </w:r>
       <w:r>
         <w:t xml:space="preserve"> </w:t>

</xml_diff>